<commit_message>
docs(report): update all dashboard figures with high-res screenshots and regenerate DOCX and PDF reports
</commit_message>
<xml_diff>
--- a/report/DS_Mini_Project_Report.docx
+++ b/report/DS_Mini_Project_Report.docx
@@ -2785,6 +2785,32 @@
           <w:color w:val="000000"/>
           <w:sz w:val="24"/>
         </w:rPr>
+        <w:t xml:space="preserve">•  FastAPI &amp; Uvicorn — </w:t>
+      </w:r>
+      <w:r>
+        <w:rPr>
+          <w:rFonts w:ascii="Liberation Serif" w:hAnsi="Liberation Serif" w:eastAsia="Liberation Serif"/>
+          <w:b w:val="0"/>
+          <w:i w:val="0"/>
+          <w:color w:val="000000"/>
+          <w:sz w:val="24"/>
+        </w:rPr>
+        <w:t>High-throughput asynchronous REST API backend serving live inference and OpenAPI docs.</w:t>
+      </w:r>
+    </w:p>
+    <w:p>
+      <w:pPr>
+        <w:spacing w:before="0" w:after="120" w:line="324" w:lineRule="auto"/>
+        <w:jc w:val="both"/>
+      </w:pPr>
+      <w:r>
+        <w:rPr>
+          <w:rFonts w:ascii="Liberation Serif" w:hAnsi="Liberation Serif" w:eastAsia="Liberation Serif"/>
+          <w:b/>
+          <w:i w:val="0"/>
+          <w:color w:val="000000"/>
+          <w:sz w:val="24"/>
+        </w:rPr>
         <w:t xml:space="preserve">•  Streamlit — </w:t>
       </w:r>
       <w:r>
@@ -2837,7 +2863,7 @@
           <w:color w:val="000000"/>
           <w:sz w:val="24"/>
         </w:rPr>
-        <w:t xml:space="preserve">•  Playwright (Chromium) — </w:t>
+        <w:t xml:space="preserve">•  Selenium / Headless Chrome — </w:t>
       </w:r>
       <w:r>
         <w:rPr>
@@ -2847,7 +2873,7 @@
           <w:color w:val="000000"/>
           <w:sz w:val="24"/>
         </w:rPr>
-        <w:t>Headless browser used to capture the dashboard screenshots.</w:t>
+        <w:t>Automated browser engine used to capture dashboard screenshots.</w:t>
       </w:r>
     </w:p>
     <w:p>
@@ -3104,7 +3130,7 @@
       <w:r>
         <w:drawing>
           <wp:inline xmlns:a="http://schemas.openxmlformats.org/drawingml/2006/main" xmlns:pic="http://schemas.openxmlformats.org/drawingml/2006/picture">
-            <wp:extent cx="5303520" cy="6094395"/>
+            <wp:extent cx="5303520" cy="5556800"/>
             <wp:docPr id="2" name="Picture 2"/>
             <wp:cNvGraphicFramePr>
               <a:graphicFrameLocks noChangeAspect="1"/>
@@ -3125,7 +3151,7 @@
                   <pic:spPr>
                     <a:xfrm>
                       <a:off x="0" y="0"/>
-                      <a:ext cx="5303520" cy="6094395"/>
+                      <a:ext cx="5303520" cy="5556800"/>
                     </a:xfrm>
                     <a:prstGeom prst="rect"/>
                   </pic:spPr>
@@ -3159,7 +3185,7 @@
       <w:r>
         <w:drawing>
           <wp:inline xmlns:a="http://schemas.openxmlformats.org/drawingml/2006/main" xmlns:pic="http://schemas.openxmlformats.org/drawingml/2006/picture">
-            <wp:extent cx="5303520" cy="6094395"/>
+            <wp:extent cx="5303520" cy="5556800"/>
             <wp:docPr id="3" name="Picture 3"/>
             <wp:cNvGraphicFramePr>
               <a:graphicFrameLocks noChangeAspect="1"/>
@@ -3180,7 +3206,7 @@
                   <pic:spPr>
                     <a:xfrm>
                       <a:off x="0" y="0"/>
-                      <a:ext cx="5303520" cy="6094395"/>
+                      <a:ext cx="5303520" cy="5556800"/>
                     </a:xfrm>
                     <a:prstGeom prst="rect"/>
                   </pic:spPr>
@@ -3214,7 +3240,7 @@
       <w:r>
         <w:drawing>
           <wp:inline xmlns:a="http://schemas.openxmlformats.org/drawingml/2006/main" xmlns:pic="http://schemas.openxmlformats.org/drawingml/2006/picture">
-            <wp:extent cx="5303520" cy="7415624"/>
+            <wp:extent cx="5303520" cy="5556800"/>
             <wp:docPr id="4" name="Picture 4"/>
             <wp:cNvGraphicFramePr>
               <a:graphicFrameLocks noChangeAspect="1"/>
@@ -3235,7 +3261,7 @@
                   <pic:spPr>
                     <a:xfrm>
                       <a:off x="0" y="0"/>
-                      <a:ext cx="5303520" cy="7415624"/>
+                      <a:ext cx="5303520" cy="5556800"/>
                     </a:xfrm>
                     <a:prstGeom prst="rect"/>
                   </pic:spPr>
@@ -3269,7 +3295,7 @@
       <w:r>
         <w:drawing>
           <wp:inline xmlns:a="http://schemas.openxmlformats.org/drawingml/2006/main" xmlns:pic="http://schemas.openxmlformats.org/drawingml/2006/picture">
-            <wp:extent cx="5303520" cy="7415624"/>
+            <wp:extent cx="5303520" cy="5556800"/>
             <wp:docPr id="5" name="Picture 5"/>
             <wp:cNvGraphicFramePr>
               <a:graphicFrameLocks noChangeAspect="1"/>
@@ -3290,7 +3316,7 @@
                   <pic:spPr>
                     <a:xfrm>
                       <a:off x="0" y="0"/>
-                      <a:ext cx="5303520" cy="7415624"/>
+                      <a:ext cx="5303520" cy="5556800"/>
                     </a:xfrm>
                     <a:prstGeom prst="rect"/>
                   </pic:spPr>
@@ -3324,7 +3350,7 @@
       <w:r>
         <w:drawing>
           <wp:inline xmlns:a="http://schemas.openxmlformats.org/drawingml/2006/main" xmlns:pic="http://schemas.openxmlformats.org/drawingml/2006/picture">
-            <wp:extent cx="5303520" cy="5163954"/>
+            <wp:extent cx="5303520" cy="5556800"/>
             <wp:docPr id="6" name="Picture 6"/>
             <wp:cNvGraphicFramePr>
               <a:graphicFrameLocks noChangeAspect="1"/>
@@ -3345,7 +3371,7 @@
                   <pic:spPr>
                     <a:xfrm>
                       <a:off x="0" y="0"/>
-                      <a:ext cx="5303520" cy="5163954"/>
+                      <a:ext cx="5303520" cy="5556800"/>
                     </a:xfrm>
                     <a:prstGeom prst="rect"/>
                   </pic:spPr>
@@ -3379,7 +3405,7 @@
       <w:r>
         <w:drawing>
           <wp:inline xmlns:a="http://schemas.openxmlformats.org/drawingml/2006/main" xmlns:pic="http://schemas.openxmlformats.org/drawingml/2006/picture">
-            <wp:extent cx="4847088" cy="7589519"/>
+            <wp:extent cx="5303520" cy="5556800"/>
             <wp:docPr id="7" name="Picture 7"/>
             <wp:cNvGraphicFramePr>
               <a:graphicFrameLocks noChangeAspect="1"/>
@@ -3400,7 +3426,7 @@
                   <pic:spPr>
                     <a:xfrm>
                       <a:off x="0" y="0"/>
-                      <a:ext cx="4847088" cy="7589519"/>
+                      <a:ext cx="5303520" cy="5556800"/>
                     </a:xfrm>
                     <a:prstGeom prst="rect"/>
                   </pic:spPr>
@@ -3434,7 +3460,7 @@
       <w:r>
         <w:drawing>
           <wp:inline xmlns:a="http://schemas.openxmlformats.org/drawingml/2006/main" xmlns:pic="http://schemas.openxmlformats.org/drawingml/2006/picture">
-            <wp:extent cx="5303520" cy="6764314"/>
+            <wp:extent cx="5303520" cy="5556800"/>
             <wp:docPr id="8" name="Picture 8"/>
             <wp:cNvGraphicFramePr>
               <a:graphicFrameLocks noChangeAspect="1"/>
@@ -3455,7 +3481,7 @@
                   <pic:spPr>
                     <a:xfrm>
                       <a:off x="0" y="0"/>
-                      <a:ext cx="5303520" cy="6764314"/>
+                      <a:ext cx="5303520" cy="5556800"/>
                     </a:xfrm>
                     <a:prstGeom prst="rect"/>
                   </pic:spPr>
@@ -3489,7 +3515,7 @@
       <w:r>
         <w:drawing>
           <wp:inline xmlns:a="http://schemas.openxmlformats.org/drawingml/2006/main" xmlns:pic="http://schemas.openxmlformats.org/drawingml/2006/picture">
-            <wp:extent cx="5303520" cy="6503790"/>
+            <wp:extent cx="5303520" cy="5556800"/>
             <wp:docPr id="9" name="Picture 9"/>
             <wp:cNvGraphicFramePr>
               <a:graphicFrameLocks noChangeAspect="1"/>
@@ -3510,7 +3536,7 @@
                   <pic:spPr>
                     <a:xfrm>
                       <a:off x="0" y="0"/>
-                      <a:ext cx="5303520" cy="6503790"/>
+                      <a:ext cx="5303520" cy="5556800"/>
                     </a:xfrm>
                     <a:prstGeom prst="rect"/>
                   </pic:spPr>
@@ -3532,7 +3558,117 @@
           <w:i/>
           <w:sz w:val="20"/>
         </w:rPr>
-        <w:t>Fig. 8: Try the model tab – live prediction (Negative, 56.9%) and confusion matrix on the test split</w:t>
+        <w:t>Fig. 8: Live Model &amp; Explainable AI (XAI) tab – prediction, token-level feature attribution, and evaluation matrix</w:t>
+      </w:r>
+    </w:p>
+    <w:p>
+      <w:pPr>
+        <w:keepNext/>
+        <w:spacing w:before="160" w:after="40"/>
+        <w:jc w:val="center"/>
+      </w:pPr>
+      <w:r>
+        <w:drawing>
+          <wp:inline xmlns:a="http://schemas.openxmlformats.org/drawingml/2006/main" xmlns:pic="http://schemas.openxmlformats.org/drawingml/2006/picture">
+            <wp:extent cx="5303520" cy="5556800"/>
+            <wp:docPr id="10" name="Picture 10"/>
+            <wp:cNvGraphicFramePr>
+              <a:graphicFrameLocks noChangeAspect="1"/>
+            </wp:cNvGraphicFramePr>
+            <a:graphic>
+              <a:graphicData uri="http://schemas.openxmlformats.org/drawingml/2006/picture">
+                <pic:pic>
+                  <pic:nvPicPr>
+                    <pic:cNvPr id="0" name="07-anomalies.png"/>
+                    <pic:cNvPicPr/>
+                  </pic:nvPicPr>
+                  <pic:blipFill>
+                    <a:blip r:embed="rId18"/>
+                    <a:stretch>
+                      <a:fillRect/>
+                    </a:stretch>
+                  </pic:blipFill>
+                  <pic:spPr>
+                    <a:xfrm>
+                      <a:off x="0" y="0"/>
+                      <a:ext cx="5303520" cy="5556800"/>
+                    </a:xfrm>
+                    <a:prstGeom prst="rect"/>
+                  </pic:spPr>
+                </pic:pic>
+              </a:graphicData>
+            </a:graphic>
+          </wp:inline>
+        </w:drawing>
+      </w:r>
+    </w:p>
+    <w:p>
+      <w:pPr>
+        <w:spacing w:after="120"/>
+        <w:jc w:val="center"/>
+      </w:pPr>
+      <w:r>
+        <w:rPr>
+          <w:rFonts w:ascii="Liberation Serif" w:hAnsi="Liberation Serif"/>
+          <w:i/>
+          <w:sz w:val="20"/>
+        </w:rPr>
+        <w:t>Fig. 9: Outbreak Anomaly Signals – rolling Z-score surveillance (+1.5σ threshold) detecting unusual surges in chatter</w:t>
+      </w:r>
+    </w:p>
+    <w:p>
+      <w:pPr>
+        <w:keepNext/>
+        <w:spacing w:before="160" w:after="40"/>
+        <w:jc w:val="center"/>
+      </w:pPr>
+      <w:r>
+        <w:drawing>
+          <wp:inline xmlns:a="http://schemas.openxmlformats.org/drawingml/2006/main" xmlns:pic="http://schemas.openxmlformats.org/drawingml/2006/picture">
+            <wp:extent cx="5303520" cy="3638015"/>
+            <wp:docPr id="11" name="Picture 11"/>
+            <wp:cNvGraphicFramePr>
+              <a:graphicFrameLocks noChangeAspect="1"/>
+            </wp:cNvGraphicFramePr>
+            <a:graphic>
+              <a:graphicData uri="http://schemas.openxmlformats.org/drawingml/2006/picture">
+                <pic:pic>
+                  <pic:nvPicPr>
+                    <pic:cNvPr id="0" name="08-flux-web.png"/>
+                    <pic:cNvPicPr/>
+                  </pic:nvPicPr>
+                  <pic:blipFill>
+                    <a:blip r:embed="rId19"/>
+                    <a:stretch>
+                      <a:fillRect/>
+                    </a:stretch>
+                  </pic:blipFill>
+                  <pic:spPr>
+                    <a:xfrm>
+                      <a:off x="0" y="0"/>
+                      <a:ext cx="5303520" cy="3638015"/>
+                    </a:xfrm>
+                    <a:prstGeom prst="rect"/>
+                  </pic:spPr>
+                </pic:pic>
+              </a:graphicData>
+            </a:graphic>
+          </wp:inline>
+        </w:drawing>
+      </w:r>
+    </w:p>
+    <w:p>
+      <w:pPr>
+        <w:spacing w:after="120"/>
+        <w:jc w:val="center"/>
+      </w:pPr>
+      <w:r>
+        <w:rPr>
+          <w:rFonts w:ascii="Liberation Serif" w:hAnsi="Liberation Serif"/>
+          <w:i/>
+          <w:sz w:val="20"/>
+        </w:rPr>
+        <w:t>Fig. 10: FLUX Clinical Web Command Center &amp; Research Portal (FastAPI backend + Single-Page Application)</w:t>
       </w:r>
     </w:p>
     <w:p>

</xml_diff>